<commit_message>
Seting up Shinjiru VPS
</commit_message>
<xml_diff>
--- a/doc/UAT-SignOff-Form-ResortsSetup.docx
+++ b/doc/UAT-SignOff-Form-ResortsSetup.docx
@@ -236,16 +236,7 @@
           <w:sz w:val="20"/>
           <w:szCs w:val="20"/>
         </w:rPr>
-        <w:t xml:space="preserve"> </w:t>
-      </w:r>
-      <w:r>
-        <w:rPr>
-          <w:rFonts w:ascii="Calibri" w:hAnsi="Calibri" w:cs="Calibri"/>
-          <w:color w:val="000000"/>
-          <w:sz w:val="20"/>
-          <w:szCs w:val="20"/>
-        </w:rPr>
-        <w:t>— general behaviour of the module.</w:t>
+        <w:t xml:space="preserve"> — general behaviour of the module.</w:t>
       </w:r>
       <w:r>
         <w:rPr>
@@ -741,16 +732,7 @@
                 <w:sz w:val="18"/>
                 <w:szCs w:val="18"/>
               </w:rPr>
-              <w:t xml:space="preserve"> </w:t>
-            </w:r>
-            <w:r>
-              <w:rPr>
-                <w:rFonts w:ascii="Calibri" w:eastAsia="Times New Roman" w:hAnsi="Calibri" w:cs="Calibri"/>
-                <w:color w:val="000000"/>
-                <w:sz w:val="18"/>
-                <w:szCs w:val="18"/>
-              </w:rPr>
-              <w:t>appears in the sidebar for permitted departments only</w:t>
+              <w:t xml:space="preserve"> appears in the sidebar for permitted departments only</w:t>
             </w:r>
           </w:p>
         </w:tc>
@@ -4604,16 +4586,7 @@
                 <w:sz w:val="18"/>
                 <w:szCs w:val="18"/>
               </w:rPr>
-              <w:t xml:space="preserve">Public &amp; </w:t>
-            </w:r>
-            <w:r>
-              <w:rPr>
-                <w:rFonts w:ascii="Calibri" w:eastAsia="Times New Roman" w:hAnsi="Calibri" w:cs="Calibri"/>
-                <w:color w:val="000000"/>
-                <w:sz w:val="18"/>
-                <w:szCs w:val="18"/>
-              </w:rPr>
-              <w:t>School Holidays Maintenance and Setup</w:t>
+              <w:t>Public &amp; School Holidays Maintenance and Setup</w:t>
             </w:r>
           </w:p>
         </w:tc>
@@ -5485,6 +5458,7 @@
           <w:szCs w:val="20"/>
         </w:rPr>
       </w:pPr>
+      <w:proofErr w:type="spellStart"/>
       <w:r>
         <w:rPr>
           <w:rStyle w:val="Strong"/>
@@ -5493,7 +5467,18 @@
           <w:sz w:val="20"/>
           <w:szCs w:val="20"/>
         </w:rPr>
-        <w:t>Fn 6</w:t>
+        <w:t>Fn</w:t>
+      </w:r>
+      <w:proofErr w:type="spellEnd"/>
+      <w:r>
+        <w:rPr>
+          <w:rStyle w:val="Strong"/>
+          <w:rFonts w:ascii="Calibri" w:eastAsia="Times New Roman" w:hAnsi="Calibri" w:cs="Calibri"/>
+          <w:color w:val="000000"/>
+          <w:sz w:val="20"/>
+          <w:szCs w:val="20"/>
+        </w:rPr>
+        <w:t xml:space="preserve"> 6</w:t>
       </w:r>
       <w:r>
         <w:rPr>
@@ -5519,6 +5504,7 @@
           <w:szCs w:val="20"/>
         </w:rPr>
       </w:pPr>
+      <w:proofErr w:type="spellStart"/>
       <w:r>
         <w:rPr>
           <w:rStyle w:val="Strong"/>
@@ -5527,7 +5513,18 @@
           <w:sz w:val="20"/>
           <w:szCs w:val="20"/>
         </w:rPr>
-        <w:t>Fn 9</w:t>
+        <w:t>Fn</w:t>
+      </w:r>
+      <w:proofErr w:type="spellEnd"/>
+      <w:r>
+        <w:rPr>
+          <w:rStyle w:val="Strong"/>
+          <w:rFonts w:ascii="Calibri" w:eastAsia="Times New Roman" w:hAnsi="Calibri" w:cs="Calibri"/>
+          <w:color w:val="000000"/>
+          <w:sz w:val="20"/>
+          <w:szCs w:val="20"/>
+        </w:rPr>
+        <w:t xml:space="preserve"> 9</w:t>
       </w:r>
       <w:r>
         <w:rPr>
@@ -5538,6 +5535,7 @@
         </w:rPr>
         <w:t xml:space="preserve"> is worked one month at a time and </w:t>
       </w:r>
+      <w:proofErr w:type="spellStart"/>
       <w:r>
         <w:rPr>
           <w:rStyle w:val="Strong"/>
@@ -5546,7 +5544,18 @@
           <w:sz w:val="20"/>
           <w:szCs w:val="20"/>
         </w:rPr>
-        <w:t>fn 10</w:t>
+        <w:t>fn</w:t>
+      </w:r>
+      <w:proofErr w:type="spellEnd"/>
+      <w:r>
+        <w:rPr>
+          <w:rStyle w:val="Strong"/>
+          <w:rFonts w:ascii="Calibri" w:eastAsia="Times New Roman" w:hAnsi="Calibri" w:cs="Calibri"/>
+          <w:color w:val="000000"/>
+          <w:sz w:val="20"/>
+          <w:szCs w:val="20"/>
+        </w:rPr>
+        <w:t xml:space="preserve"> 10</w:t>
       </w:r>
       <w:r>
         <w:rPr>
@@ -7686,7 +7695,6 @@
                 <w:sz w:val="18"/>
                 <w:szCs w:val="18"/>
               </w:rPr>
-              <w:lastRenderedPageBreak/>
               <w:t>3.3</w:t>
             </w:r>
           </w:p>
@@ -8989,6 +8997,7 @@
                 <w:sz w:val="18"/>
                 <w:szCs w:val="18"/>
               </w:rPr>
+              <w:lastRenderedPageBreak/>
               <w:t>3.10</w:t>
             </w:r>
           </w:p>
@@ -9226,7 +9235,27 @@
           <w:sz w:val="20"/>
           <w:szCs w:val="20"/>
         </w:rPr>
-        <w:t xml:space="preserve"> — these should already have maintenance and RCI bulk bank deducted, and must not be double-counted.</w:t>
+        <w:t xml:space="preserve"> — these should already have maintenance and RCI bulk bank </w:t>
+      </w:r>
+      <w:proofErr w:type="gramStart"/>
+      <w:r>
+        <w:rPr>
+          <w:rFonts w:ascii="Calibri" w:eastAsia="Times New Roman" w:hAnsi="Calibri" w:cs="Calibri"/>
+          <w:color w:val="000000"/>
+          <w:sz w:val="20"/>
+          <w:szCs w:val="20"/>
+        </w:rPr>
+        <w:t>deducted, and</w:t>
+      </w:r>
+      <w:proofErr w:type="gramEnd"/>
+      <w:r>
+        <w:rPr>
+          <w:rFonts w:ascii="Calibri" w:eastAsia="Times New Roman" w:hAnsi="Calibri" w:cs="Calibri"/>
+          <w:color w:val="000000"/>
+          <w:sz w:val="20"/>
+          <w:szCs w:val="20"/>
+        </w:rPr>
+        <w:t xml:space="preserve"> must not be double-counted.</w:t>
       </w:r>
     </w:p>
     <w:p>
@@ -9591,16 +9620,7 @@
                 <w:sz w:val="18"/>
                 <w:szCs w:val="18"/>
               </w:rPr>
-              <w:t xml:space="preserve"> </w:t>
-            </w:r>
-            <w:r>
-              <w:rPr>
-                <w:rFonts w:ascii="Calibri" w:eastAsia="Times New Roman" w:hAnsi="Calibri" w:cs="Calibri"/>
-                <w:color w:val="000000"/>
-                <w:sz w:val="18"/>
-                <w:szCs w:val="18"/>
-              </w:rPr>
-              <w:t>— create/modify user and date, and lock-status columns, are dropped from every table. So are the accounting codes on Company Master, the per-apartment-type check-in/out times, and the LVC incoming / outgoing / fax-batch counters.</w:t>
+              <w:t xml:space="preserve"> — create/modify user and date, and lock-status columns, are dropped from every table. So are the accounting codes on Company Master, the per-apartment-type check-in/out times, and the LVC incoming / outgoing / fax-batch counters.</w:t>
             </w:r>
           </w:p>
         </w:tc>
@@ -9727,7 +9747,27 @@
                 <w:sz w:val="18"/>
                 <w:szCs w:val="18"/>
               </w:rPr>
-              <w:t xml:space="preserve"> Retired resorts keep their master record (fn 2) but carry no units or availability.</w:t>
+              <w:t xml:space="preserve"> Retired resorts keep their master record (</w:t>
+            </w:r>
+            <w:proofErr w:type="spellStart"/>
+            <w:r>
+              <w:rPr>
+                <w:rFonts w:ascii="Calibri" w:eastAsia="Times New Roman" w:hAnsi="Calibri" w:cs="Calibri"/>
+                <w:color w:val="000000"/>
+                <w:sz w:val="18"/>
+                <w:szCs w:val="18"/>
+              </w:rPr>
+              <w:t>fn</w:t>
+            </w:r>
+            <w:proofErr w:type="spellEnd"/>
+            <w:r>
+              <w:rPr>
+                <w:rFonts w:ascii="Calibri" w:eastAsia="Times New Roman" w:hAnsi="Calibri" w:cs="Calibri"/>
+                <w:color w:val="000000"/>
+                <w:sz w:val="18"/>
+                <w:szCs w:val="18"/>
+              </w:rPr>
+              <w:t xml:space="preserve"> 2) but carry no units or availability.</w:t>
             </w:r>
           </w:p>
         </w:tc>
@@ -10179,25 +10219,38 @@
                 <w:sz w:val="18"/>
                 <w:szCs w:val="18"/>
               </w:rPr>
-              <w:t>Only the rate currently in force was kept for each resort in fn 10.</w:t>
-            </w:r>
-            <w:r>
-              <w:rPr>
-                <w:rFonts w:ascii="Calibri" w:eastAsia="Times New Roman" w:hAnsi="Calibri" w:cs="Calibri"/>
-                <w:color w:val="000000"/>
-                <w:sz w:val="18"/>
-                <w:szCs w:val="18"/>
-              </w:rPr>
-              <w:t xml:space="preserve"> </w:t>
-            </w:r>
-            <w:r>
-              <w:rPr>
-                <w:rFonts w:ascii="Calibri" w:eastAsia="Times New Roman" w:hAnsi="Calibri" w:cs="Calibri"/>
-                <w:color w:val="000000"/>
-                <w:sz w:val="18"/>
-                <w:szCs w:val="18"/>
-              </w:rPr>
-              <w:t>SIS held the same chart re-keyed year after year (4,766 rows over 1,062 resort-years, but only 303 genuinely different charts — five resorts had re-keyed an identical chart 24 years running). Prior years' charts were not migrated; history builds up from go-live.</w:t>
+              <w:t xml:space="preserve">Only the rate currently in force was kept for each resort in </w:t>
+            </w:r>
+            <w:proofErr w:type="spellStart"/>
+            <w:r>
+              <w:rPr>
+                <w:rStyle w:val="Strong"/>
+                <w:rFonts w:ascii="Calibri" w:eastAsia="Times New Roman" w:hAnsi="Calibri" w:cs="Calibri"/>
+                <w:color w:val="000000"/>
+                <w:sz w:val="18"/>
+                <w:szCs w:val="18"/>
+              </w:rPr>
+              <w:t>fn</w:t>
+            </w:r>
+            <w:proofErr w:type="spellEnd"/>
+            <w:r>
+              <w:rPr>
+                <w:rStyle w:val="Strong"/>
+                <w:rFonts w:ascii="Calibri" w:eastAsia="Times New Roman" w:hAnsi="Calibri" w:cs="Calibri"/>
+                <w:color w:val="000000"/>
+                <w:sz w:val="18"/>
+                <w:szCs w:val="18"/>
+              </w:rPr>
+              <w:t xml:space="preserve"> 10.</w:t>
+            </w:r>
+            <w:r>
+              <w:rPr>
+                <w:rFonts w:ascii="Calibri" w:eastAsia="Times New Roman" w:hAnsi="Calibri" w:cs="Calibri"/>
+                <w:color w:val="000000"/>
+                <w:sz w:val="18"/>
+                <w:szCs w:val="18"/>
+              </w:rPr>
+              <w:t xml:space="preserve"> SIS held the same chart re-keyed year after year (4,766 rows over 1,062 resort-years, but only 303 genuinely different charts — five resorts had re-keyed an identical chart 24 years running). Prior years' charts were not migrated; history builds up from go-live.</w:t>
             </w:r>
           </w:p>
         </w:tc>
@@ -10885,16 +10938,7 @@
                 <w:sz w:val="18"/>
                 <w:szCs w:val="18"/>
               </w:rPr>
-              <w:t xml:space="preserve"> </w:t>
-            </w:r>
-            <w:r>
-              <w:rPr>
-                <w:rFonts w:ascii="Calibri" w:eastAsia="Times New Roman" w:hAnsi="Calibri" w:cs="Calibri"/>
-                <w:color w:val="000000"/>
-                <w:sz w:val="18"/>
-                <w:szCs w:val="18"/>
-              </w:rPr>
-              <w:t xml:space="preserve">The 2026 dates were supplied by the business and keyed directly. Several public holidays are deliberately stored on the </w:t>
+              <w:t xml:space="preserve"> The 2026 dates were supplied by the business and keyed directly. Several public holidays are deliberately stored on the </w:t>
             </w:r>
             <w:r>
               <w:rPr>
@@ -12199,16 +12243,27 @@
                 <w:sz w:val="18"/>
                 <w:szCs w:val="18"/>
               </w:rPr>
-              <w:t>User / Department Head</w:t>
-            </w:r>
-            <w:r>
-              <w:rPr>
-                <w:rFonts w:ascii="Calibri" w:eastAsia="Times New Roman" w:hAnsi="Calibri" w:cs="Calibri"/>
-                <w:color w:val="000000"/>
-                <w:sz w:val="18"/>
-                <w:szCs w:val="18"/>
-              </w:rPr>
-              <w:t xml:space="preserve"> (Resort Operations)</w:t>
+              <w:t xml:space="preserve">User / </w:t>
+            </w:r>
+            <w:r>
+              <w:rPr>
+                <w:rStyle w:val="Strong"/>
+                <w:rFonts w:ascii="Calibri" w:eastAsia="Times New Roman" w:hAnsi="Calibri" w:cs="Calibri"/>
+                <w:color w:val="000000"/>
+                <w:sz w:val="18"/>
+                <w:szCs w:val="18"/>
+              </w:rPr>
+              <w:t>T</w:t>
+            </w:r>
+            <w:r>
+              <w:rPr>
+                <w:rStyle w:val="Strong"/>
+                <w:rFonts w:ascii="Calibri" w:hAnsi="Calibri" w:cs="Calibri"/>
+                <w:color w:val="000000"/>
+                <w:sz w:val="18"/>
+                <w:szCs w:val="18"/>
+              </w:rPr>
+              <w:t>ester</w:t>
             </w:r>
           </w:p>
         </w:tc>
@@ -12334,7 +12389,34 @@
                 <w:sz w:val="18"/>
                 <w:szCs w:val="18"/>
               </w:rPr>
-              <w:t>IT / Project Owner</w:t>
+              <w:t>Department Head</w:t>
+            </w:r>
+            <w:r>
+              <w:rPr>
+                <w:rFonts w:ascii="Calibri" w:eastAsia="Times New Roman" w:hAnsi="Calibri" w:cs="Calibri"/>
+                <w:color w:val="000000"/>
+                <w:sz w:val="18"/>
+                <w:szCs w:val="18"/>
+              </w:rPr>
+              <w:t xml:space="preserve"> (</w:t>
+            </w:r>
+            <w:r>
+              <w:rPr>
+                <w:rFonts w:ascii="Calibri" w:eastAsia="Times New Roman" w:hAnsi="Calibri" w:cs="Calibri"/>
+                <w:color w:val="000000"/>
+                <w:sz w:val="18"/>
+                <w:szCs w:val="18"/>
+              </w:rPr>
+              <w:t>Member Services</w:t>
+            </w:r>
+            <w:r>
+              <w:rPr>
+                <w:rFonts w:ascii="Calibri" w:eastAsia="Times New Roman" w:hAnsi="Calibri" w:cs="Calibri"/>
+                <w:color w:val="000000"/>
+                <w:sz w:val="18"/>
+                <w:szCs w:val="18"/>
+              </w:rPr>
+              <w:t>)</w:t>
             </w:r>
           </w:p>
         </w:tc>
@@ -12776,16 +12858,17 @@
                 <w:sz w:val="18"/>
                 <w:szCs w:val="18"/>
               </w:rPr>
-              <w:t>User / Department Head</w:t>
-            </w:r>
-            <w:r>
-              <w:rPr>
-                <w:rFonts w:ascii="Calibri" w:eastAsia="Times New Roman" w:hAnsi="Calibri" w:cs="Calibri"/>
-                <w:color w:val="000000"/>
-                <w:sz w:val="18"/>
-                <w:szCs w:val="18"/>
-              </w:rPr>
-              <w:t xml:space="preserve"> (Resort Operations)</w:t>
+              <w:t xml:space="preserve">User / </w:t>
+            </w:r>
+            <w:r>
+              <w:rPr>
+                <w:rStyle w:val="Strong"/>
+                <w:rFonts w:ascii="Calibri" w:eastAsia="Times New Roman" w:hAnsi="Calibri" w:cs="Calibri"/>
+                <w:color w:val="000000"/>
+                <w:sz w:val="18"/>
+                <w:szCs w:val="18"/>
+              </w:rPr>
+              <w:t>Tester</w:t>
             </w:r>
           </w:p>
         </w:tc>
@@ -12911,7 +12994,7 @@
                 <w:sz w:val="18"/>
                 <w:szCs w:val="18"/>
               </w:rPr>
-              <w:t>User / Department Head</w:t>
+              <w:t>Department Head</w:t>
             </w:r>
             <w:r>
               <w:rPr>
@@ -12921,132 +13004,6 @@
                 <w:szCs w:val="18"/>
               </w:rPr>
               <w:t xml:space="preserve"> (Member Services)</w:t>
-            </w:r>
-          </w:p>
-        </w:tc>
-        <w:tc>
-          <w:tcPr>
-            <w:tcW w:w="1100" w:type="pct"/>
-            <w:tcBorders>
-              <w:top w:val="single" w:sz="6" w:space="0" w:color="808080"/>
-              <w:left w:val="single" w:sz="6" w:space="0" w:color="808080"/>
-              <w:bottom w:val="single" w:sz="6" w:space="0" w:color="808080"/>
-              <w:right w:val="single" w:sz="6" w:space="0" w:color="808080"/>
-            </w:tcBorders>
-            <w:tcMar>
-              <w:top w:w="60" w:type="dxa"/>
-              <w:left w:w="100" w:type="dxa"/>
-              <w:bottom w:w="60" w:type="dxa"/>
-              <w:right w:w="100" w:type="dxa"/>
-            </w:tcMar>
-            <w:hideMark/>
-          </w:tcPr>
-          <w:p>
-            <w:pPr>
-              <w:spacing w:before="120" w:after="200"/>
-              <w:rPr>
-                <w:rFonts w:ascii="Calibri" w:eastAsia="Times New Roman" w:hAnsi="Calibri" w:cs="Calibri"/>
-                <w:color w:val="000000"/>
-                <w:sz w:val="18"/>
-                <w:szCs w:val="18"/>
-              </w:rPr>
-            </w:pPr>
-          </w:p>
-        </w:tc>
-        <w:tc>
-          <w:tcPr>
-            <w:tcW w:w="1300" w:type="pct"/>
-            <w:tcBorders>
-              <w:top w:val="single" w:sz="6" w:space="0" w:color="808080"/>
-              <w:left w:val="single" w:sz="6" w:space="0" w:color="808080"/>
-              <w:bottom w:val="single" w:sz="6" w:space="0" w:color="808080"/>
-              <w:right w:val="single" w:sz="6" w:space="0" w:color="808080"/>
-            </w:tcBorders>
-            <w:tcMar>
-              <w:top w:w="60" w:type="dxa"/>
-              <w:left w:w="100" w:type="dxa"/>
-              <w:bottom w:w="60" w:type="dxa"/>
-              <w:right w:w="100" w:type="dxa"/>
-            </w:tcMar>
-            <w:hideMark/>
-          </w:tcPr>
-          <w:p>
-            <w:pPr>
-              <w:spacing w:before="120" w:after="200"/>
-              <w:rPr>
-                <w:rFonts w:eastAsia="Times New Roman"/>
-                <w:sz w:val="20"/>
-                <w:szCs w:val="20"/>
-              </w:rPr>
-            </w:pPr>
-          </w:p>
-        </w:tc>
-        <w:tc>
-          <w:tcPr>
-            <w:tcW w:w="900" w:type="pct"/>
-            <w:tcBorders>
-              <w:top w:val="single" w:sz="6" w:space="0" w:color="808080"/>
-              <w:left w:val="single" w:sz="6" w:space="0" w:color="808080"/>
-              <w:bottom w:val="single" w:sz="6" w:space="0" w:color="808080"/>
-              <w:right w:val="single" w:sz="6" w:space="0" w:color="808080"/>
-            </w:tcBorders>
-            <w:tcMar>
-              <w:top w:w="60" w:type="dxa"/>
-              <w:left w:w="100" w:type="dxa"/>
-              <w:bottom w:w="60" w:type="dxa"/>
-              <w:right w:w="100" w:type="dxa"/>
-            </w:tcMar>
-            <w:hideMark/>
-          </w:tcPr>
-          <w:p>
-            <w:pPr>
-              <w:spacing w:before="120" w:after="200"/>
-              <w:rPr>
-                <w:rFonts w:eastAsia="Times New Roman"/>
-                <w:sz w:val="20"/>
-                <w:szCs w:val="20"/>
-              </w:rPr>
-            </w:pPr>
-          </w:p>
-        </w:tc>
-      </w:tr>
-      <w:tr>
-        <w:tc>
-          <w:tcPr>
-            <w:tcW w:w="1700" w:type="pct"/>
-            <w:tcBorders>
-              <w:top w:val="single" w:sz="6" w:space="0" w:color="808080"/>
-              <w:left w:val="single" w:sz="6" w:space="0" w:color="808080"/>
-              <w:bottom w:val="single" w:sz="6" w:space="0" w:color="808080"/>
-              <w:right w:val="single" w:sz="6" w:space="0" w:color="808080"/>
-            </w:tcBorders>
-            <w:tcMar>
-              <w:top w:w="60" w:type="dxa"/>
-              <w:left w:w="100" w:type="dxa"/>
-              <w:bottom w:w="60" w:type="dxa"/>
-              <w:right w:w="100" w:type="dxa"/>
-            </w:tcMar>
-            <w:hideMark/>
-          </w:tcPr>
-          <w:p>
-            <w:pPr>
-              <w:spacing w:before="120" w:after="200"/>
-              <w:rPr>
-                <w:rFonts w:ascii="Calibri" w:eastAsia="Times New Roman" w:hAnsi="Calibri" w:cs="Calibri"/>
-                <w:color w:val="000000"/>
-                <w:sz w:val="18"/>
-                <w:szCs w:val="18"/>
-              </w:rPr>
-            </w:pPr>
-            <w:r>
-              <w:rPr>
-                <w:rStyle w:val="Strong"/>
-                <w:rFonts w:ascii="Calibri" w:eastAsia="Times New Roman" w:hAnsi="Calibri" w:cs="Calibri"/>
-                <w:color w:val="000000"/>
-                <w:sz w:val="18"/>
-                <w:szCs w:val="18"/>
-              </w:rPr>
-              <w:t>IT / Project Owner</w:t>
             </w:r>
           </w:p>
         </w:tc>

</xml_diff>